<commit_message>
Fix grammar and update docs to reflect project completion
</commit_message>
<xml_diff>
--- a/submissions/Stanley_Okafor_COMP2154_Final_Report.docx
+++ b/submissions/Stanley_Okafor_COMP2154_Final_Report.docx
@@ -128,31 +128,31 @@
         </w:numPr>
       </w:pPr>
       <w:r>
-        <w:t xml:space="preserve">primary user/job seeker</w:t>
-      </w:r>
-    </w:p>
-    <w:p>
-      <w:pPr>
-        <w:pStyle w:val="ListParagraph"/>
-        <w:numPr>
-          <w:ilvl w:val="0"/>
-          <w:numId w:val="1"/>
-        </w:numPr>
-      </w:pPr>
-      <w:r>
-        <w:t xml:space="preserve">course evaluator/instructor</w:t>
-      </w:r>
-    </w:p>
-    <w:p>
-      <w:pPr>
-        <w:pStyle w:val="ListParagraph"/>
-        <w:numPr>
-          <w:ilvl w:val="0"/>
-          <w:numId w:val="1"/>
-        </w:numPr>
-      </w:pPr>
-      <w:r>
-        <w:t xml:space="preserve">future maintainers of the codebase</w:t>
+        <w:t xml:space="preserve">Primary user/job seeker</w:t>
+      </w:r>
+    </w:p>
+    <w:p>
+      <w:pPr>
+        <w:pStyle w:val="ListParagraph"/>
+        <w:numPr>
+          <w:ilvl w:val="0"/>
+          <w:numId w:val="1"/>
+        </w:numPr>
+      </w:pPr>
+      <w:r>
+        <w:t xml:space="preserve">Course evaluator/instructor</w:t>
+      </w:r>
+    </w:p>
+    <w:p>
+      <w:pPr>
+        <w:pStyle w:val="ListParagraph"/>
+        <w:numPr>
+          <w:ilvl w:val="0"/>
+          <w:numId w:val="1"/>
+        </w:numPr>
+      </w:pPr>
+      <w:r>
+        <w:t xml:space="preserve">Future maintainers of the codebase</w:t>
       </w:r>
     </w:p>
     <w:p/>

</xml_diff>